<commit_message>
Updated Professional Services v1 Deliverables
</commit_message>
<xml_diff>
--- a/docs/2_Value_Creation/2a_Product/Professional_Networking/Professional_Networking_v1_Epic-Hypothesis-Statement.docx
+++ b/docs/2_Value_Creation/2a_Product/Professional_Networking/Professional_Networking_v1_Epic-Hypothesis-Statement.docx
@@ -23,7 +23,7 @@
         <mc:AlternateContent>
           <mc:Choice Requires="wps">
             <w:drawing>
-              <wp:anchor distT="0" distB="0" distL="114300" distR="114300" simplePos="0" relativeHeight="251659264" behindDoc="0" locked="0" layoutInCell="1" allowOverlap="1" wp14:anchorId="1C1C1E7C" wp14:editId="658665F5">
+              <wp:anchor distT="0" distB="0" distL="114300" distR="114300" simplePos="0" relativeHeight="251658240" behindDoc="0" locked="0" layoutInCell="1" allowOverlap="1" wp14:anchorId="1C1C1E7C" wp14:editId="658665F5">
                 <wp:simplePos x="0" y="0"/>
                 <wp:positionH relativeFrom="column">
                   <wp:posOffset>0</wp:posOffset>
@@ -119,7 +119,7 @@
           </mc:Choice>
           <mc:Fallback>
             <w:pict>
-              <v:shape w14:anchorId="1C1C1E7C" id="Round Same Side Corner Rectangle 2" o:spid="_x0000_s1026" style="position:absolute;margin-left:0;margin-top:5.5pt;width:467.7pt;height:32.45pt;z-index:251659264;visibility:visible;mso-wrap-style:square;mso-width-percent:0;mso-wrap-distance-left:9pt;mso-wrap-distance-top:0;mso-wrap-distance-right:9pt;mso-wrap-distance-bottom:0;mso-position-horizontal:absolute;mso-position-horizontal-relative:text;mso-position-vertical:absolute;mso-position-vertical-relative:text;mso-width-percent:0;mso-width-relative:margin;v-text-anchor:middle" coordsize="5939790,412115" o:spt="100" o:gfxdata="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" adj="-11796480,,5400" path="m22192,l5917598,v12256,,22192,9936,22192,22192l5939790,412115r,l,412115r,l,22192c,9936,9936,,22192,xe" fillcolor="#437b7e" strokecolor="#437b7e" strokeweight="1pt">
+              <v:shape w14:anchorId="1C1C1E7C" id="Round Same Side Corner Rectangle 2" o:spid="_x0000_s1026" style="position:absolute;margin-left:0;margin-top:5.5pt;width:467.7pt;height:32.45pt;z-index:251658240;visibility:visible;mso-wrap-style:square;mso-width-percent:0;mso-wrap-distance-left:9pt;mso-wrap-distance-top:0;mso-wrap-distance-right:9pt;mso-wrap-distance-bottom:0;mso-position-horizontal:absolute;mso-position-horizontal-relative:text;mso-position-vertical:absolute;mso-position-vertical-relative:text;mso-width-percent:0;mso-width-relative:margin;v-text-anchor:middle" coordsize="5939790,412115" o:spt="100" o:gfxdata="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" adj="-11796480,,5400" path="m22192,l5917598,v12256,,22192,9936,22192,22192l5939790,412115r,l,412115r,l,22192c,9936,9936,,22192,xe" fillcolor="#437b7e" strokecolor="#437b7e" strokeweight="1pt">
                 <v:stroke joinstyle="miter"/>
                 <v:formulas/>
                 <v:path arrowok="t" o:connecttype="custom" o:connectlocs="22192,0;5917598,0;5939790,22192;5939790,412115;5939790,412115;0,412115;0,412115;0,22192;22192,0" o:connectangles="0,0,0,0,0,0,0,0,0" textboxrect="0,0,5939790,412115"/>
@@ -275,6 +275,14 @@
                 <w:szCs w:val="22"/>
               </w:rPr>
               <w:t>Professional Networking</w:t>
+            </w:r>
+            <w:r>
+              <w:rPr>
+                <w:rFonts w:ascii="Arial" w:hAnsi="Arial" w:cs="Arial"/>
+                <w:sz w:val="22"/>
+                <w:szCs w:val="22"/>
+              </w:rPr>
+              <w:t xml:space="preserve"> v1</w:t>
             </w:r>
           </w:p>
         </w:tc>
@@ -1300,7 +1308,7 @@
         <w:noProof/>
       </w:rPr>
       <w:drawing>
-        <wp:anchor distT="0" distB="0" distL="114300" distR="114300" simplePos="0" relativeHeight="251659264" behindDoc="0" locked="0" layoutInCell="1" allowOverlap="1" wp14:anchorId="7875CD05" wp14:editId="13949170">
+        <wp:anchor distT="0" distB="0" distL="114300" distR="114300" simplePos="0" relativeHeight="251658240" behindDoc="0" locked="0" layoutInCell="1" allowOverlap="1" wp14:anchorId="7875CD05" wp14:editId="13949170">
           <wp:simplePos x="0" y="0"/>
           <wp:positionH relativeFrom="column">
             <wp:posOffset>-681990</wp:posOffset>
@@ -2063,6 +2071,7 @@
   <w:style w:type="character" w:default="1" w:styleId="DefaultParagraphFont">
     <w:name w:val="Default Paragraph Font"/>
     <w:uiPriority w:val="1"/>
+    <w:semiHidden/>
     <w:unhideWhenUsed/>
   </w:style>
   <w:style w:type="table" w:default="1" w:styleId="TableNormal">

</xml_diff>